<commit_message>
Add parents rights hub and correct legal articles and templates
</commit_message>
<xml_diff>
--- a/downloads/akteneinsicht-25-sgb-x-art-15-dsgvo.docx
+++ b/downloads/akteneinsicht-25-sgb-x-art-15-dsgvo.docx
@@ -4,387 +4,395 @@
   <w:body>
     <w:p>
       <w:pPr>
-        <w:spacing w:after="40"/>
+        <w:pStyle w:val="Title"/>
+        <w:widowControl/>
       </w:pPr>
       <w:r>
-        <w:rPr>
-          <w:b/>
-          <w:color w:val="1F3A5F"/>
-          <w:sz w:val="30"/>
-        </w:rPr>
-        <w:t>Musterbrief 1 — Antrag auf vollständige Akteneinsicht</w:t>
+        <w:rPr/>
+        <w:t>Antrag auf Akteneinsicht</w:t>
       </w:r>
     </w:p>
     <w:p>
       <w:pPr>
-        <w:spacing w:after="200"/>
+        <w:widowControl/>
       </w:pPr>
       <w:r>
-        <w:rPr>
-          <w:color w:val="1F3A5F"/>
-          <w:sz w:val="21"/>
-        </w:rPr>
-        <w:t>§ 25 SGB X · Art. 15 DSGVO</w:t>
+        <w:rPr/>
+        <w:t>[Vorname Nachname]</w:t>
+        <w:br/>
+        <w:t>[Straße Hausnummer]</w:t>
+        <w:br/>
+        <w:t>[Postleitzahl Ort]</w:t>
       </w:r>
     </w:p>
     <w:p>
       <w:pPr>
-        <w:spacing w:after="40"/>
+        <w:widowControl/>
       </w:pPr>
       <w:r>
-        <w:rPr>
-          <w:b/>
-          <w:sz w:val="20"/>
-        </w:rPr>
-        <w:t>Wann du diesen Brief brauchst:</w:t>
+        <w:rPr/>
+        <w:t>An [Name des Jugendamts]</w:t>
+        <w:br/>
+        <w:t>[Aktenführende Abteilung]</w:t>
+        <w:br/>
+        <w:t>[Straße Hausnummer]</w:t>
+        <w:br/>
+        <w:t>[Postleitzahl Ort]</w:t>
       </w:r>
     </w:p>
     <w:p>
       <w:pPr>
-        <w:spacing w:after="160"/>
+        <w:widowControl/>
       </w:pPr>
       <w:r>
-        <w:rPr>
-          <w:color w:val="444444"/>
-          <w:sz w:val="20"/>
-        </w:rPr>
-        <w:t>Immer, so früh wie möglich – du kannst nichts widerlegen, was du nicht kennst.</w:t>
-      </w:r>
-    </w:p>
-    <w:p>
-      <w:pPr>
-        <w:spacing w:after="40"/>
-      </w:pPr>
-      <w:r>
-        <w:rPr>
-          <w:b/>
-          <w:sz w:val="20"/>
-        </w:rPr>
-        <w:t>Bitte zuerst lesen:</w:t>
-      </w:r>
-    </w:p>
-    <w:p>
-      <w:pPr>
-        <w:spacing w:after="160"/>
-      </w:pPr>
-      <w:r>
-        <w:rPr>
-          <w:color w:val="444444"/>
-          <w:sz w:val="20"/>
-        </w:rPr>
-        <w:t>Diese Vorlage ist eine allgemeine Formulierungshilfe, keine Rechtsberatung im Einzelfall und keine Rechtsdienstleistung. Ersetze alle Angaben in eckigen Klammern […] durch deine eigenen Daten, streiche, was auf dich nicht zutrifft, und lass den Brief im Zweifel anwaltlich prüfen. Versende wichtige Schreiben per Einschreiben mit Rückschein oder gegen Empfangsbestätigung und behalte immer eine Kopie.</w:t>
-      </w:r>
-    </w:p>
-    <w:p>
-      <w:pPr>
-        <w:spacing w:after="240"/>
-      </w:pPr>
-      <w:r>
-        <w:t>──────────────────────────────────────────────</w:t>
-      </w:r>
-    </w:p>
-    <w:p>
-      <w:pPr>
-        <w:spacing w:after="200"/>
-      </w:pPr>
-      <w:r>
-        <w:t>[Vorname Nachname]</w:t>
-      </w:r>
-      <w:r>
-        <w:br/>
-      </w:r>
-      <w:r>
-        <w:t>[Straße, Hausnummer]</w:t>
-      </w:r>
-      <w:r>
-        <w:br/>
-      </w:r>
-      <w:r>
-        <w:t>[PLZ Ort]</w:t>
-      </w:r>
-      <w:r>
-        <w:br/>
-      </w:r>
-      <w:r>
-        <w:t>[Telefon] · [E-Mail]</w:t>
-      </w:r>
-    </w:p>
-    <w:p>
-      <w:pPr>
-        <w:spacing w:after="200"/>
-      </w:pPr>
-      <w:r>
-        <w:t>Jugendamt [Stadt/Landkreis]</w:t>
-      </w:r>
-      <w:r>
-        <w:br/>
-      </w:r>
-      <w:r>
-        <w:t>[Abteilung / Allgemeiner Sozialer Dienst]</w:t>
-      </w:r>
-      <w:r>
-        <w:br/>
-      </w:r>
-      <w:r>
-        <w:t>[Straße, PLZ Ort]</w:t>
-      </w:r>
-    </w:p>
-    <w:p>
-      <w:pPr>
-        <w:spacing w:after="200"/>
-        <w:jc w:val="right"/>
-      </w:pPr>
-      <w:r>
+        <w:rPr/>
         <w:t>[Ort], [Datum]</w:t>
       </w:r>
     </w:p>
     <w:p>
       <w:pPr>
-        <w:spacing w:after="200"/>
+        <w:widowControl/>
       </w:pPr>
       <w:r>
         <w:rPr>
           <w:b/>
         </w:rPr>
-        <w:t>Betreff: Antrag auf vollständige Akteneinsicht gemäß § 25 SGB X und Auskunft</w:t>
-      </w:r>
-      <w:r>
+        <w:t>Betreff: Akteneinsicht nach § 25 SGB X</w:t>
         <w:br/>
-      </w:r>
-      <w:r>
-        <w:t xml:space="preserve">         nach Art. 15 DSGVO</w:t>
-      </w:r>
-      <w:r>
-        <w:br/>
-      </w:r>
-      <w:r>
-        <w:t xml:space="preserve">         Kind: [Name], geb. [Geburtsdatum] · Aktenzeichen: [falls bekannt]</w:t>
+        <w:t>Verfahren: [Bezeichnung] · Aktenzeichen: [falls bekannt]</w:t>
       </w:r>
     </w:p>
     <w:p>
       <w:pPr>
-        <w:spacing w:after="200"/>
+        <w:widowControl/>
       </w:pPr>
       <w:r>
+        <w:rPr/>
         <w:t>Sehr geehrte Damen und Herren,</w:t>
       </w:r>
     </w:p>
     <w:p>
       <w:pPr>
-        <w:spacing w:after="160"/>
+        <w:widowControl/>
       </w:pPr>
       <w:r>
-        <w:t>zur Wahrnehmung meiner rechtlichen Interessen im oben genannten Verfahren beantrage ich hiermit vollständige Einsicht in die mich und mein Kind betreffenden Akten gemäß § 25 SGB X sowie Auskunft über die zu meiner Person und zu meinem Kind gespeicherten Daten gemäß Art. 15 DSGVO.</w:t>
+        <w:rPr/>
+        <w:t>als Beteiligte beziehungsweise Beteiligter im genannten Verwaltungsverfahren beantrage ich Einsicht in die das Verfahren betreffenden Akten, soweit deren Kenntnis zur Geltendmachung oder Verteidigung meiner rechtlichen Interessen erforderlich ist.</w:t>
       </w:r>
     </w:p>
     <w:p>
       <w:pPr>
-        <w:spacing w:after="160"/>
+        <w:widowControl/>
       </w:pPr>
       <w:r>
-        <w:t>Der Antrag erstreckt sich ausdrücklich auf:</w:t>
+        <w:rPr/>
+        <w:t>Mein Bezug zum Verfahren und mein rechtliches Interesse: [Zum Beispiel Prüfung der Tatsachengrundlage einer konkret bezeichneten Maßnahme oder Vorbereitung einer Stellungnahme. Falls eine Vollmacht besteht: Vertretung und Umfang angeben.]</w:t>
       </w:r>
     </w:p>
     <w:p>
       <w:pPr>
-        <w:spacing w:after="40"/>
-        <w:ind w:left="397" w:hanging="227"/>
+        <w:widowControl/>
       </w:pPr>
       <w:r>
-        <w:t>- die Hauptakte sowie sämtliche Neben- und Handakten,</w:t>
+        <w:rPr>
+          <w:b/>
+        </w:rPr>
+        <w:t>Soweit verfahrensbezogen und vom Einsichtsrecht erfasst, bitte ich insbesondere um Zugang zu:</w:t>
       </w:r>
     </w:p>
     <w:p>
       <w:pPr>
-        <w:spacing w:after="40"/>
-        <w:ind w:left="397" w:hanging="227"/>
+        <w:pStyle w:val="ListBullet"/>
+        <w:widowControl/>
       </w:pPr>
       <w:r>
-        <w:t>- Gesprächsvermerke und interne Aktennotizen,</w:t>
+        <w:rPr/>
+        <w:t>Bescheiden, Anträgen und entscheidungserheblichen Unterlagen;</w:t>
       </w:r>
     </w:p>
     <w:p>
       <w:pPr>
-        <w:spacing w:after="40"/>
-        <w:ind w:left="397" w:hanging="227"/>
+        <w:pStyle w:val="ListBullet"/>
+        <w:widowControl/>
       </w:pPr>
       <w:r>
-        <w:t>- die Gefährdungseinschätzung(en) nach § 8a SGB VIII,</w:t>
+        <w:rPr/>
+        <w:t>Gesprächsvermerken, dokumentierten Gefährdungseinschätzungen und Berichten;</w:t>
       </w:r>
     </w:p>
     <w:p>
       <w:pPr>
-        <w:spacing w:after="40"/>
-        <w:ind w:left="397" w:hanging="227"/>
+        <w:pStyle w:val="ListBullet"/>
+        <w:widowControl/>
       </w:pPr>
       <w:r>
-        <w:t>- Berichte und Stellungnahmen an das Familiengericht,</w:t>
+        <w:rPr/>
+        <w:t>dem Verfahren zugeordneten Nebenakten und relevanter Korrespondenz, etwa mit Einrichtungen oder anderen Stellen.</w:t>
       </w:r>
     </w:p>
     <w:p>
       <w:pPr>
-        <w:spacing w:after="40"/>
-        <w:ind w:left="397" w:hanging="227"/>
+        <w:widowControl/>
       </w:pPr>
       <w:r>
-        <w:t>- Korrespondenz mit Dritten (Schule, Kita, Ärzte, Einrichtungen),</w:t>
+        <w:rPr/>
+        <w:t>Ich bevorzuge [Termin zur Einsicht / Übersendung zulässiger Kopien / bei elektronischer Aktenführung elektronische Bereitstellung]. Bitte teilen Sie mir vorab mit, ob und in welcher Höhe Kosten entstehen. Diese Bitte legt keine gesetzlich zwingende Form der Akteneinsicht fest.</w:t>
       </w:r>
     </w:p>
     <w:p>
       <w:pPr>
-        <w:spacing w:after="40"/>
-        <w:ind w:left="397" w:hanging="227"/>
+        <w:widowControl/>
       </w:pPr>
       <w:r>
-        <w:t>- E-Mail-Korrespondenz, soweit sie zur Akte genommen wurde.</w:t>
+        <w:rPr/>
+        <w:t>Werden einzelne Unterlagen oder Angaben ausgenommen, bitte ich um Mitteilung der Einschränkung und ihrer Rechtsgrundlage, soweit dies rechtlich zulässig ist. Bitte prüfen Sie, ob teilweise Einsicht oder Schwärzung ausreicht.</w:t>
       </w:r>
     </w:p>
     <w:p>
       <w:pPr>
-        <w:spacing w:after="160"/>
+        <w:widowControl/>
       </w:pPr>
       <w:r>
-        <w:t>Ich bitte um Übersendung vollständiger Kopien an die oben genannte Anschrift. Sollten Kosten anfallen, bitte ich um vorherige Mitteilung der Höhe. Alternativ bitte ich um einen Termin zur Einsichtnahme vor Ort mit der Möglichkeit, Fotos oder Kopien anzufertigen.</w:t>
+        <w:rPr/>
+        <w:t>Bitte teilen Sie mir bis [Datum] den vorgesehenen Zugang oder Bearbeitungsstand mit. Dies ist eine erbetene Rückmeldung, keine Behauptung einer gesetzlichen 14-Tage-Frist. Eine besondere Dringlichkeit ergibt sich aus [gegebenenfalls konkret angeben].</w:t>
       </w:r>
     </w:p>
     <w:p>
       <w:pPr>
-        <w:spacing w:after="160"/>
+        <w:widowControl/>
       </w:pPr>
       <w:r>
-        <w:t>Sollten Teile der Akte von der Einsicht ausgenommen werden, bitte ich um schriftliche Mitteilung, welche Teile dies betrifft und auf welche Rechtsgrundlage die Einschränkung gestützt wird.</w:t>
+        <w:rPr/>
+        <w:t>Mit freundlichen Grüßen</w:t>
+        <w:br/>
+        <w:br/>
+        <w:t>[Unterschrift bei schriftlicher Einreichung]</w:t>
+        <w:br/>
+        <w:t>[Vorname Nachname]</w:t>
+      </w:r>
+    </w:p>
+    <w:p>
+      <w:r>
+        <w:br w:type="page"/>
       </w:r>
     </w:p>
     <w:p>
       <w:pPr>
-        <w:spacing w:after="200"/>
+        <w:pStyle w:val="Title"/>
+        <w:widowControl/>
       </w:pPr>
       <w:r>
-        <w:t>Ich bitte um Rückmeldung bis zum [Datum, 14 Tage].</w:t>
+        <w:rPr/>
+        <w:t>Hinweise zur Verwendung</w:t>
       </w:r>
     </w:p>
     <w:p>
       <w:pPr>
-        <w:spacing w:after="200"/>
+        <w:widowControl/>
       </w:pPr>
       <w:r>
-        <w:t>Mit freundlichen Grüßen</w:t>
+        <w:rPr/>
+        <w:t>Diese Vorlage gilt für Akteneinsicht von Beteiligten im Anwendungsbereich des SGB X. Sie ist kein pauschaler Antrag auf Offenlegung sämtlicher Daten jeder beteiligten Person.</w:t>
       </w:r>
     </w:p>
     <w:p>
       <w:pPr>
-        <w:spacing w:after="200"/>
+        <w:pStyle w:val="Heading1"/>
+        <w:widowControl/>
       </w:pPr>
       <w:r>
-        <w:t>[Handschriftliche Unterschrift]</w:t>
-      </w:r>
-      <w:r>
-        <w:br/>
-      </w:r>
-      <w:r>
-        <w:t>[Vorname Nachname]</w:t>
+        <w:rPr/>
+        <w:t>Vor dem Absenden</w:t>
       </w:r>
     </w:p>
     <w:p>
       <w:pPr>
-        <w:spacing w:before="240"/>
+        <w:pStyle w:val="ListBullet"/>
+        <w:widowControl/>
       </w:pPr>
       <w:r>
-        <w:t>──────────────────────────────────────────────</w:t>
+        <w:rPr/>
+        <w:t>§ 25 Abs. 1 SGB X setzt Beteiligtenstellung und die Erforderlichkeit für rechtliche Interessen voraus. Entscheidungsentwürfe und unmittelbare Vorbereitungsarbeiten sind bis zum Abschluss des Verwaltungsverfahrens ausgenommen.</w:t>
       </w:r>
     </w:p>
     <w:p>
       <w:pPr>
-        <w:spacing w:after="40"/>
+        <w:pStyle w:val="ListBullet"/>
+        <w:widowControl/>
       </w:pPr>
       <w:r>
-        <w:rPr>
-          <w:b/>
-          <w:sz w:val="20"/>
-        </w:rPr>
-        <w:t>Das gehört in deinen Fall hinein:</w:t>
+        <w:rPr/>
+        <w:t>Berechtigte Geheimhaltungsinteressen von Beteiligten und Dritten können die Einsicht begrenzen. Hinzu kommen besondere Schutzvorschriften, etwa § 65 SGB VIII. Fragen Sie nach Teilzugang, soweit möglich.</w:t>
       </w:r>
     </w:p>
     <w:p>
       <w:pPr>
-        <w:spacing w:after="160"/>
+        <w:pStyle w:val="ListBullet"/>
+        <w:widowControl/>
       </w:pPr>
       <w:r>
-        <w:rPr>
-          <w:color w:val="444444"/>
-          <w:sz w:val="20"/>
-        </w:rPr>
-        <w:t>Aktenzeichen, falls du eines hast; das genaue Geburtsdatum des Kindes; die Anschrift des zuständigen Jugendamts (nicht der Zentrale).</w:t>
+        <w:rPr/>
+        <w:t>§ 25 Abs. 4 und 5 SGB X regelt Ort und Formen der Einsicht. Auszüge und Kopien sind im Umfang des Einsichtsrechts möglich; angemessener Aufwendungsersatz kann verlangt werden. Ein Recht auf unverschlüsselte Zusendung per E-Mail folgt daraus nicht.</w:t>
       </w:r>
     </w:p>
     <w:p>
       <w:pPr>
-        <w:spacing w:after="40"/>
+        <w:pStyle w:val="ListBullet"/>
+        <w:widowControl/>
       </w:pPr>
       <w:r>
-        <w:rPr>
-          <w:b/>
-          <w:sz w:val="20"/>
-        </w:rPr>
-        <w:t>Das gehört nicht hinein:</w:t>
+        <w:rPr/>
+        <w:t>Eine selbst gesetzte Frist von 14 Tagen ist eine Bitte. Sie verändert weder gesetzliche Rechtsbehelfsfristen noch schafft sie automatisch einen Anspruch auf eine Entscheidung an diesem Tag.</w:t>
       </w:r>
     </w:p>
     <w:p>
       <w:pPr>
-        <w:spacing w:after="160"/>
+        <w:pStyle w:val="ListBullet"/>
+        <w:widowControl/>
       </w:pPr>
       <w:r>
-        <w:rPr>
-          <w:color w:val="444444"/>
-          <w:sz w:val="20"/>
-        </w:rPr>
-        <w:t>Vorwürfe, Begründungen, warum du misstrauisch bist, oder eine Erklärung deiner Lebenssituation. Ein Akteneinsichtsantrag braucht keine Rechtfertigung.</w:t>
+        <w:rPr/>
+        <w:t>Für die Gerichtsakte gilt grundsätzlich § 13 FamFG, nicht § 25 SGB X. Für Auskunft über eigene personenbezogene Daten nutzen Sie bei Bedarf einen getrennten Antrag nach Art. 15 DSGVO und § 83 SGB X.</w:t>
       </w:r>
     </w:p>
     <w:p>
       <w:pPr>
-        <w:spacing w:after="40"/>
+        <w:pStyle w:val="ListBullet"/>
+        <w:widowControl/>
       </w:pPr>
       <w:r>
-        <w:rPr>
-          <w:b/>
-          <w:sz w:val="20"/>
-        </w:rPr>
-        <w:t>Was du wissen solltest:</w:t>
+        <w:rPr/>
+        <w:t>Bei Kindesdaten oder Vertretung des Kindes müssen Vertretungsbefugnis und eigene Rechte des Kindes gesondert geprüft werden. Beantragen Sie keine fremden Daten ohne rechtliche Grundlage.</w:t>
       </w:r>
     </w:p>
     <w:p>
       <w:pPr>
-        <w:spacing w:after="160"/>
+        <w:pStyle w:val="Heading1"/>
+        <w:widowControl/>
       </w:pPr>
       <w:r>
-        <w:rPr>
-          <w:color w:val="444444"/>
-          <w:sz w:val="20"/>
-        </w:rPr>
-        <w:t>Das Recht aus § 25 SGB X besteht, soweit die Kenntnis zur Geltendmachung oder Verteidigung deiner rechtlichen Interessen erforderlich ist. Es ist nicht schrankenlos: Angaben, die Dritte betreffen — etwa die meldende Person oder Aussagen des anderen Elternteils — können geschwärzt werden. Deshalb der vorletzte Absatz: Du fragst gezielt nach, was warum ausgenommen wurde. Eine pauschale Ablehnung ohne Begründung musst du nicht hinnehmen.</w:t>
+        <w:rPr/>
+        <w:t>Versand und Nachweis</w:t>
       </w:r>
     </w:p>
     <w:p>
       <w:pPr>
-        <w:spacing w:before="280"/>
+        <w:widowControl/>
       </w:pPr>
       <w:r>
-        <w:rPr>
-          <w:color w:val="777777"/>
-          <w:sz w:val="17"/>
-        </w:rPr>
-        <w:t>Systemfehler Familie · systemfehlerfamilie.de — Vorlage zur eigenen Verwendung. Keine Rechtsberatung. Rechtsstand: August 2026.</w:t>
+        <w:rPr/>
+        <w:t>Ersetzen Sie alle Platzhalter und streichen Sie nicht passende Teile. Senden Sie nur die ausgefüllte Briefseite; diese Hinweise behalten Sie. Bewahren Sie eine Kopie und einen Zugangsnachweis auf. Bei fristgebundenen Erklärungen sind die vorgeschriebene Form, der richtige Empfänger und der rechtzeitige Eingang entscheidend. Gewöhnliche E-Mail oder Postaufgabe am letzten Tag sichern eine Frist nicht automatisch.</w:t>
       </w:r>
     </w:p>
+    <w:p>
+      <w:pPr>
+        <w:pStyle w:val="Heading1"/>
+        <w:widowControl/>
+      </w:pPr>
+      <w:r>
+        <w:rPr/>
+        <w:t>Rechtsgrundlagen</w:t>
+      </w:r>
+    </w:p>
+    <w:p>
+      <w:pPr>
+        <w:spacing w:after="100"/>
+      </w:pPr>
+      <w:hyperlink r:id="rId10">
+        <w:r>
+          <w:rPr>
+            <w:color w:val="1D4E68"/>
+          </w:rPr>
+          <w:t>§ 25 SGB X</w:t>
+        </w:r>
+      </w:hyperlink>
+    </w:p>
+    <w:p>
+      <w:pPr>
+        <w:spacing w:after="100"/>
+      </w:pPr>
+      <w:hyperlink r:id="rId11">
+        <w:r>
+          <w:rPr>
+            <w:color w:val="1D4E68"/>
+          </w:rPr>
+          <w:t>§ 13 FamFG</w:t>
+        </w:r>
+      </w:hyperlink>
+    </w:p>
+    <w:p>
+      <w:pPr>
+        <w:spacing w:after="100"/>
+      </w:pPr>
+      <w:hyperlink r:id="rId12">
+        <w:r>
+          <w:rPr>
+            <w:color w:val="1D4E68"/>
+          </w:rPr>
+          <w:t>§ 65 SGB VIII</w:t>
+        </w:r>
+      </w:hyperlink>
+    </w:p>
+    <w:p>
+      <w:pPr>
+        <w:spacing w:after="100"/>
+      </w:pPr>
+      <w:hyperlink r:id="rId13">
+        <w:r>
+          <w:rPr>
+            <w:color w:val="1D4E68"/>
+          </w:rPr>
+          <w:t>§ 83 SGB X</w:t>
+        </w:r>
+      </w:hyperlink>
+    </w:p>
+    <w:p>
+      <w:pPr>
+        <w:widowControl/>
+      </w:pPr>
+      <w:r>
+        <w:rPr/>
+        <w:t>Redaktionell überarbeitet am 26.10.2026. Diese Vorlage ist allgemeine Information und ersetzt keine Prüfung des Einzelfalls. Unterstützung finden Sie bei einer geeigneten anwaltlichen Beratung oder einer Ombudsstelle nach § 9a SGB VIII.</w:t>
+      </w:r>
+    </w:p>
+    <w:p>
+      <w:pPr>
+        <w:spacing w:after="100"/>
+      </w:pPr>
+      <w:hyperlink r:id="rId14">
+        <w:r>
+          <w:rPr>
+            <w:color w:val="1D4E68"/>
+          </w:rPr>
+          <w:t>Rechte für Eltern und weitere Hilfen</w:t>
+        </w:r>
+      </w:hyperlink>
+    </w:p>
     <w:sectPr>
+      <w:footerReference w:type="default" r:id="rId9"/>
       <w:pgSz w:w="12240" w:h="15840"/>
-      <w:pgMar w:top="1134" w:right="1134" w:bottom="1134" w:left="1361" w:header="720" w:footer="720" w:gutter="0"/>
+      <w:pgMar w:top="1037" w:right="1152" w:bottom="1037" w:left="1152" w:header="461" w:footer="461" w:gutter="0"/>
       <w:cols w:space="720"/>
       <w:docGrid w:linePitch="360"/>
     </w:sectPr>
   </w:body>
 </w:document>
+</file>
+
+<file path=word/footer1.xml><?xml version="1.0" encoding="utf-8"?>
+<w:ftr xmlns:m="http://schemas.openxmlformats.org/officeDocument/2006/math" xmlns:mc="http://schemas.openxmlformats.org/markup-compatibility/2006" xmlns:mo="http://schemas.microsoft.com/office/mac/office/2008/main" xmlns:mv="urn:schemas-microsoft-com:mac:vml" xmlns:o="urn:schemas-microsoft-com:office:office" xmlns:r="http://schemas.openxmlformats.org/officeDocument/2006/relationships" xmlns:v="urn:schemas-microsoft-com:vml" xmlns:w10="urn:schemas-microsoft-com:office:word" xmlns:w14="http://schemas.microsoft.com/office/word/2010/wordml" xmlns:w="http://schemas.openxmlformats.org/wordprocessingml/2006/main" xmlns:wne="http://schemas.microsoft.com/office/word/2006/wordml" xmlns:wp14="http://schemas.microsoft.com/office/word/2010/wordprocessingDrawing" xmlns:wp="http://schemas.openxmlformats.org/drawingml/2006/wordprocessingDrawing" xmlns:wpc="http://schemas.microsoft.com/office/word/2010/wordprocessingCanvas" xmlns:wpg="http://schemas.microsoft.com/office/word/2010/wordprocessingGroup" xmlns:wpi="http://schemas.microsoft.com/office/word/2010/wordprocessingInk" xmlns:wps="http://schemas.microsoft.com/office/word/2010/wordprocessingShape" mc:Ignorable="w14 wp14">
+  <w:p>
+    <w:pPr>
+      <w:pStyle w:val="Footer"/>
+    </w:pPr>
+    <w:r>
+      <w:rPr>
+        <w:sz w:val="16"/>
+      </w:rPr>
+      <w:t>systemfehlerfamilie.de  |  Fassung 26.10.2026  |  Allgemeine Formulierungshilfe</w:t>
+    </w:r>
+  </w:p>
+</w:ftr>
 </file>
 
 <file path=word/numbering.xml><?xml version="1.0" encoding="utf-8"?>
@@ -750,9 +758,13 @@
     <w:name w:val="Normal"/>
     <w:qFormat/>
     <w:rsid w:val="00FC693F"/>
+    <w:pPr>
+      <w:spacing w:line="252" w:lineRule="auto" w:after="120"/>
+    </w:pPr>
     <w:rPr>
-      <w:rFonts w:ascii="Calibri" w:hAnsi="Calibri"/>
-      <w:sz w:val="22"/>
+      <w:rFonts w:ascii="Arial" w:hAnsi="Arial"/>
+      <w:color w:val="000000"/>
+      <w:sz w:val="21"/>
     </w:rPr>
   </w:style>
   <w:style w:type="paragraph" w:styleId="Header">
@@ -810,15 +822,15 @@
     <w:pPr>
       <w:keepNext/>
       <w:keepLines/>
-      <w:spacing w:before="480" w:after="0"/>
+      <w:spacing w:before="180" w:after="100" w:line="252" w:lineRule="auto"/>
       <w:outlineLvl w:val="0"/>
     </w:pPr>
     <w:rPr>
-      <w:rFonts w:asciiTheme="majorHAnsi" w:eastAsiaTheme="majorEastAsia" w:hAnsiTheme="majorHAnsi" w:cstheme="majorBidi"/>
+      <w:rFonts w:asciiTheme="majorHAnsi" w:eastAsiaTheme="majorEastAsia" w:hAnsiTheme="majorHAnsi" w:cstheme="majorBidi" w:ascii="Arial" w:hAnsi="Arial"/>
       <w:b/>
       <w:bCs/>
-      <w:color w:val="365F91" w:themeColor="accent1" w:themeShade="BF"/>
-      <w:sz w:val="28"/>
+      <w:color w:val="000000"/>
+      <w:sz w:val="24"/>
       <w:szCs w:val="28"/>
     </w:rPr>
   </w:style>
@@ -834,15 +846,15 @@
     <w:pPr>
       <w:keepNext/>
       <w:keepLines/>
-      <w:spacing w:before="200" w:after="0"/>
+      <w:spacing w:before="180" w:after="100" w:line="252" w:lineRule="auto"/>
       <w:outlineLvl w:val="1"/>
     </w:pPr>
     <w:rPr>
-      <w:rFonts w:asciiTheme="majorHAnsi" w:eastAsiaTheme="majorEastAsia" w:hAnsiTheme="majorHAnsi" w:cstheme="majorBidi"/>
+      <w:rFonts w:asciiTheme="majorHAnsi" w:eastAsiaTheme="majorEastAsia" w:hAnsiTheme="majorHAnsi" w:cstheme="majorBidi" w:ascii="Arial" w:hAnsi="Arial"/>
       <w:b/>
       <w:bCs/>
-      <w:color w:val="4F81BD" w:themeColor="accent1"/>
-      <w:sz w:val="26"/>
+      <w:color w:val="000000"/>
+      <w:sz w:val="24"/>
       <w:szCs w:val="26"/>
     </w:rPr>
   </w:style>
@@ -1096,18 +1108,15 @@
     <w:qFormat/>
     <w:rsid w:val="00FC693F"/>
     <w:pPr>
-      <w:pBdr>
-        <w:bottom w:val="single" w:sz="8" w:space="4" w:color="4F81BD" w:themeColor="accent1"/>
-      </w:pBdr>
-      <w:spacing w:after="300" w:line="240" w:lineRule="auto"/>
+      <w:spacing w:after="280" w:line="252" w:lineRule="auto"/>
       <w:contextualSpacing/>
     </w:pPr>
     <w:rPr>
-      <w:rFonts w:asciiTheme="majorHAnsi" w:eastAsiaTheme="majorEastAsia" w:hAnsiTheme="majorHAnsi" w:cstheme="majorBidi"/>
-      <w:color w:val="17365D" w:themeColor="text2" w:themeShade="BF"/>
+      <w:rFonts w:asciiTheme="majorHAnsi" w:eastAsiaTheme="majorEastAsia" w:hAnsiTheme="majorHAnsi" w:cstheme="majorBidi" w:ascii="Arial" w:hAnsi="Arial"/>
+      <w:color w:val="000000"/>
       <w:spacing w:val="5"/>
       <w:kern w:val="28"/>
-      <w:sz w:val="52"/>
+      <w:sz w:val="36"/>
       <w:szCs w:val="52"/>
     </w:rPr>
   </w:style>
@@ -1138,14 +1147,15 @@
       <w:numPr>
         <w:ilvl w:val="1"/>
       </w:numPr>
+      <w:spacing w:line="252" w:lineRule="auto" w:after="120"/>
     </w:pPr>
     <w:rPr>
-      <w:rFonts w:asciiTheme="majorHAnsi" w:eastAsiaTheme="majorEastAsia" w:hAnsiTheme="majorHAnsi" w:cstheme="majorBidi"/>
+      <w:rFonts w:asciiTheme="majorHAnsi" w:eastAsiaTheme="majorEastAsia" w:hAnsiTheme="majorHAnsi" w:cstheme="majorBidi" w:ascii="Arial" w:hAnsi="Arial"/>
       <w:i/>
       <w:iCs/>
-      <w:color w:val="4F81BD" w:themeColor="accent1"/>
+      <w:color w:val="000000"/>
       <w:spacing w:val="15"/>
-      <w:sz w:val="24"/>
+      <w:sz w:val="21"/>
       <w:szCs w:val="24"/>
     </w:rPr>
   </w:style>
@@ -1281,8 +1291,14 @@
       <w:numPr>
         <w:numId w:val="1"/>
       </w:numPr>
+      <w:spacing w:line="252" w:lineRule="auto" w:after="120"/>
       <w:contextualSpacing/>
     </w:pPr>
+    <w:rPr>
+      <w:rFonts w:ascii="Arial" w:hAnsi="Arial"/>
+      <w:color w:val="000000"/>
+      <w:sz w:val="21"/>
+    </w:rPr>
   </w:style>
   <w:style w:type="paragraph" w:styleId="ListBullet2">
     <w:name w:val="List Bullet 2"/>
@@ -1583,9 +1599,6 @@
     <w:qFormat/>
     <w:rsid w:val="00FC693F"/>
     <w:pPr>
-      <w:pBdr>
-        <w:bottom w:val="single" w:sz="4" w:space="4" w:color="4F81BD" w:themeColor="accent1"/>
-      </w:pBdr>
       <w:spacing w:before="200" w:after="280"/>
       <w:ind w:left="936" w:right="936"/>
     </w:pPr>

</xml_diff>